<commit_message>
Finalize public submission package
</commit_message>
<xml_diff>
--- a/submission/TradeWatch-LB_Final_Report.docx
+++ b/submission/TradeWatch-LB_Final_Report.docx
@@ -485,7 +485,7 @@
           <w:color w:val="163227"/>
           <w:sz w:val="22"/>
         </w:rPr>
-        <w:t>This project showed why a smaller, auditable ML system can be more useful than an impressive-sounding black box. The rewarding part was turning a broad “AI for trade” idea into an interface that exposes its evidence and limits. The hardest parts were defining mirror-comparable records, avoiding incompatible HS revisions, and evaluating an unsupervised model without trustworthy fraud labels. The response was to make those constraints part of the product: cache the source data, label comparability, validate with a synthetic sensitivity test, and state what the model cannot conclude. Personalize this paragraph with your own experience before submitting.</w:t>
+        <w:t>This project showed why a smaller, auditable ML system can be more useful than an impressive-sounding black box. The rewarding part was turning a broad “AI for trade” idea into an interface that exposes its evidence and limits. The hardest parts were defining mirror-comparable records, avoiding incompatible HS revisions, and evaluating an unsupervised model without trustworthy fraud labels. The response was to make those constraints part of the product: cache the source data, label comparability, validate with a synthetic sensitivity test, and state what the model cannot conclude. That experience reinforced the need for transparent, human-in-the-loop AI systems that prioritize evidence over unsupported conclusions.</w:t>
       </w:r>
     </w:p>
     <w:p>
@@ -517,7 +517,7 @@
           <w:color w:val="163227"/>
           <w:sz w:val="22"/>
         </w:rPr>
-        <w:t>Code, cached acquisition metadata, model configuration, test suite, and dashboard artifact are included in the TradeWatch-LB repository. Primary data source: UN Comtrade public API (comtradeapi.un.org). Method reference: UN Comtrade, Methodology Guide for Comtrade Plus. The project documentation explains its scope decision, assumptions, and prohibited claims.</w:t>
+        <w:t>Code, cached acquisition metadata, model configuration, test suite, and dashboard artifact are included in the TradeWatch-LB repository. Primary data source: UN Comtrade public API (comtradeapi.un.org). Method reference: UN Comtrade, Methodology Guide for Comtrade Plus. This report and the repository README state the project scope, assumptions, and prohibited claims.</w:t>
       </w:r>
     </w:p>
     <w:sectPr>

</xml_diff>